<commit_message>
update: remove parenthetical annotations, update rank Thai names, fix checkpoint text
</commit_message>
<xml_diff>
--- a/Unspoken Bond-รักนะ เมี๊ยวเมี๊ยว.docx
+++ b/Unspoken Bond-รักนะ เมี๊ยวเมี๊ยว.docx
@@ -80,7 +80,7 @@
     <w:p>
       <w:pPr>
         <w:rPr>
-          <w:rFonts w:ascii="TH SarabunPSK" w:hAnsi="TH SarabunPSK" w:cs="TH SarabunPSK" w:hint="cs"/>
+          <w:rFonts w:ascii="TH SarabunPSK" w:hAnsi="TH SarabunPSK" w:cs="TH SarabunPSK"/>
           <w:b/>
           <w:bCs/>
           <w:sz w:val="28"/>
@@ -128,9 +128,18 @@
           <w:sz w:val="28"/>
           <w:cs/>
         </w:rPr>
-        <w:t>รักนะ เมี</w:t>
-      </w:r>
-      <w:proofErr w:type="spellStart"/>
+        <w:t>รักนะ เมี๊ยวเมี๊ยว</w:t>
+      </w:r>
+      <w:r>
+        <w:rPr>
+          <w:rFonts w:ascii="TH SarabunPSK" w:hAnsi="TH SarabunPSK" w:cs="TH SarabunPSK"/>
+          <w:b/>
+          <w:bCs/>
+          <w:sz w:val="28"/>
+          <w:cs/>
+        </w:rPr>
+        <w:t>)</w:t>
+      </w:r>
       <w:r>
         <w:rPr>
           <w:rFonts w:ascii="TH SarabunPSK" w:hAnsi="TH SarabunPSK" w:cs="TH SarabunPSK" w:hint="cs"/>
@@ -139,36 +148,70 @@
           <w:sz w:val="28"/>
           <w:cs/>
         </w:rPr>
-        <w:t>๊ยว</w:t>
-      </w:r>
-      <w:proofErr w:type="spellEnd"/>
+        <w:t xml:space="preserve"> </w:t>
+      </w:r>
+    </w:p>
+    <w:p>
+      <w:pPr>
+        <w:ind w:left="360"/>
+        <w:rPr>
+          <w:rFonts w:ascii="TH SarabunPSK" w:hAnsi="TH SarabunPSK" w:cs="TH SarabunPSK"/>
+          <w:sz w:val="28"/>
+        </w:rPr>
+      </w:pPr>
+      <w:r>
+        <w:rPr>
+          <w:rFonts w:ascii="TH SarabunPSK" w:hAnsi="TH SarabunPSK" w:cs="TH SarabunPSK"/>
+          <w:b/>
+          <w:bCs/>
+          <w:sz w:val="28"/>
+          <w:cs/>
+        </w:rPr>
+        <w:t>คอนเซปต์หลัก:</w:t>
+      </w:r>
+      <w:r>
+        <w:rPr>
+          <w:rFonts w:ascii="TH SarabunPSK" w:hAnsi="TH SarabunPSK" w:cs="TH SarabunPSK"/>
+          <w:b/>
+          <w:bCs/>
+          <w:sz w:val="28"/>
+        </w:rPr>
+        <w:t xml:space="preserve"> </w:t>
+      </w:r>
+      <w:r>
+        <w:rPr>
+          <w:rFonts w:ascii="TH SarabunPSK" w:hAnsi="TH SarabunPSK" w:cs="TH SarabunPSK"/>
+          <w:sz w:val="28"/>
+          <w:cs/>
+        </w:rPr>
+        <w:t xml:space="preserve">เกมแนว </w:t>
+      </w:r>
+      <w:r>
+        <w:rPr>
+          <w:rFonts w:ascii="TH SarabunPSK" w:hAnsi="TH SarabunPSK" w:cs="TH SarabunPSK"/>
+          <w:sz w:val="28"/>
+        </w:rPr>
+        <w:t>Narrative-Driven</w:t>
+      </w:r>
       <w:r>
         <w:rPr>
           <w:rFonts w:ascii="TH SarabunPSK" w:hAnsi="TH SarabunPSK" w:cs="TH SarabunPSK" w:hint="cs"/>
-          <w:b/>
-          <w:bCs/>
-          <w:sz w:val="28"/>
-          <w:cs/>
-        </w:rPr>
-        <w:t>เมี</w:t>
-      </w:r>
-      <w:proofErr w:type="spellStart"/>
+          <w:sz w:val="28"/>
+          <w:cs/>
+        </w:rPr>
+        <w:t>(</w:t>
+      </w:r>
+      <w:r>
+        <w:rPr>
+          <w:rFonts w:ascii="TH SarabunPSK" w:hAnsi="TH SarabunPSK" w:cs="TH SarabunPSK"/>
+          <w:sz w:val="28"/>
+          <w:cs/>
+        </w:rPr>
+        <w:t>เน้นเนื้อเรื่อง</w:t>
+      </w:r>
       <w:r>
         <w:rPr>
           <w:rFonts w:ascii="TH SarabunPSK" w:hAnsi="TH SarabunPSK" w:cs="TH SarabunPSK" w:hint="cs"/>
-          <w:b/>
-          <w:bCs/>
-          <w:sz w:val="28"/>
-          <w:cs/>
-        </w:rPr>
-        <w:t>๊ยว</w:t>
-      </w:r>
-      <w:proofErr w:type="spellEnd"/>
-      <w:r>
-        <w:rPr>
-          <w:rFonts w:ascii="TH SarabunPSK" w:hAnsi="TH SarabunPSK" w:cs="TH SarabunPSK"/>
-          <w:b/>
-          <w:bCs/>
           <w:sz w:val="28"/>
           <w:cs/>
         </w:rPr>
@@ -176,7 +219,83 @@
       </w:r>
       <w:r>
         <w:rPr>
+          <w:rFonts w:ascii="TH SarabunPSK" w:hAnsi="TH SarabunPSK" w:cs="TH SarabunPSK"/>
+          <w:sz w:val="28"/>
+        </w:rPr>
+        <w:t xml:space="preserve"> </w:t>
+      </w:r>
+      <w:r>
+        <w:rPr>
+          <w:rFonts w:ascii="TH SarabunPSK" w:hAnsi="TH SarabunPSK" w:cs="TH SarabunPSK"/>
+          <w:sz w:val="28"/>
+          <w:cs/>
+        </w:rPr>
+        <w:t>ที่ผู้เล่นสวมบทบาทเป็นสัตว์เลี้ยงผู้มองเห็น "อารมณ์" (</w:t>
+      </w:r>
+      <w:r>
+        <w:rPr>
+          <w:rFonts w:ascii="TH SarabunPSK" w:hAnsi="TH SarabunPSK" w:cs="TH SarabunPSK"/>
+          <w:sz w:val="28"/>
+        </w:rPr>
+        <w:t xml:space="preserve">Aura) </w:t>
+      </w:r>
+      <w:r>
+        <w:rPr>
+          <w:rFonts w:ascii="TH SarabunPSK" w:hAnsi="TH SarabunPSK" w:cs="TH SarabunPSK"/>
+          <w:sz w:val="28"/>
+          <w:cs/>
+        </w:rPr>
+        <w:t>ของเจ้าของ โดยทุกการตัดสินใจเพื่อเยียวยาเจ้าของ จะสะท้อนว่าคุณ</w:t>
+      </w:r>
+      <w:r>
+        <w:rPr>
           <w:rFonts w:ascii="TH SarabunPSK" w:hAnsi="TH SarabunPSK" w:cs="TH SarabunPSK" w:hint="cs"/>
+          <w:sz w:val="28"/>
+          <w:cs/>
+        </w:rPr>
+        <w:t>เป็นสัตว์เลี้ยงที่แสดงออกภาษารักแบบไห</w:t>
+      </w:r>
+      <w:r>
+        <w:rPr>
+          <w:rFonts w:ascii="TH SarabunPSK" w:hAnsi="TH SarabunPSK" w:cs="TH SarabunPSK" w:hint="cs"/>
+          <w:sz w:val="28"/>
+          <w:cs/>
+        </w:rPr>
+        <w:t>น</w:t>
+      </w:r>
+    </w:p>
+    <w:p>
+      <w:pPr>
+        <w:ind w:left="360"/>
+        <w:rPr>
+          <w:rFonts w:ascii="TH SarabunPSK" w:hAnsi="TH SarabunPSK" w:cs="TH SarabunPSK"/>
+          <w:b/>
+          <w:bCs/>
+          <w:sz w:val="28"/>
+        </w:rPr>
+      </w:pPr>
+      <w:r>
+        <w:rPr>
+          <w:rFonts w:ascii="TH SarabunPSK" w:hAnsi="TH SarabunPSK" w:cs="TH SarabunPSK"/>
+          <w:b/>
+          <w:bCs/>
+          <w:sz w:val="28"/>
+          <w:cs/>
+        </w:rPr>
+        <w:t>แนวคำถามและการดำเนินเรื่อง (</w:t>
+      </w:r>
+      <w:r>
+        <w:rPr>
+          <w:rFonts w:ascii="TH SarabunPSK" w:hAnsi="TH SarabunPSK" w:cs="TH SarabunPSK"/>
+          <w:b/>
+          <w:bCs/>
+          <w:sz w:val="28"/>
+        </w:rPr>
+        <w:t>The Decision Matrix)</w:t>
+      </w:r>
+      <w:r>
+        <w:rPr>
+          <w:rFonts w:ascii="TH SarabunPSK" w:hAnsi="TH SarabunPSK" w:cs="TH SarabunPSK" w:hint="cs"/>
           <w:b/>
           <w:bCs/>
           <w:sz w:val="28"/>
@@ -184,24 +303,62 @@
         </w:rPr>
         <w:t xml:space="preserve"> </w:t>
       </w:r>
-    </w:p>
-    <w:p>
-      <w:pPr>
-        <w:ind w:left="360"/>
-        <w:rPr>
-          <w:rFonts w:ascii="TH SarabunPSK" w:hAnsi="TH SarabunPSK" w:cs="TH SarabunPSK"/>
-          <w:sz w:val="28"/>
-        </w:rPr>
-      </w:pPr>
-      <w:r>
-        <w:rPr>
-          <w:rFonts w:ascii="TH SarabunPSK" w:hAnsi="TH SarabunPSK" w:cs="TH SarabunPSK"/>
-          <w:b/>
-          <w:bCs/>
-          <w:sz w:val="28"/>
-          <w:cs/>
-        </w:rPr>
-        <w:t>คอนเซปต์หลัก:</w:t>
+      <w:r>
+        <w:rPr>
+          <w:rFonts w:ascii="TH SarabunPSK" w:hAnsi="TH SarabunPSK" w:cs="TH SarabunPSK"/>
+          <w:sz w:val="28"/>
+          <w:cs/>
+        </w:rPr>
+        <w:t>ในแต่ละสถานการณ์ (</w:t>
+      </w:r>
+      <w:r>
+        <w:rPr>
+          <w:rFonts w:ascii="TH SarabunPSK" w:hAnsi="TH SarabunPSK" w:cs="TH SarabunPSK"/>
+          <w:sz w:val="28"/>
+        </w:rPr>
+        <w:t xml:space="preserve">Scene) </w:t>
+      </w:r>
+      <w:r>
+        <w:rPr>
+          <w:rFonts w:ascii="TH SarabunPSK" w:hAnsi="TH SarabunPSK" w:cs="TH SarabunPSK"/>
+          <w:sz w:val="28"/>
+          <w:cs/>
+        </w:rPr>
+        <w:t xml:space="preserve">ตัวเลือกจะถูกซ่อนคะแนน </w:t>
+      </w:r>
+      <w:r>
+        <w:rPr>
+          <w:rFonts w:ascii="TH SarabunPSK" w:hAnsi="TH SarabunPSK" w:cs="TH SarabunPSK"/>
+          <w:sz w:val="28"/>
+        </w:rPr>
+        <w:t xml:space="preserve">MBTI </w:t>
+      </w:r>
+      <w:r>
+        <w:rPr>
+          <w:rFonts w:ascii="TH SarabunPSK" w:hAnsi="TH SarabunPSK" w:cs="TH SarabunPSK"/>
+          <w:sz w:val="28"/>
+          <w:cs/>
+        </w:rPr>
+        <w:t>ไว้ ดังนี้:</w:t>
+      </w:r>
+    </w:p>
+    <w:p>
+      <w:pPr>
+        <w:rPr>
+          <w:rFonts w:ascii="TH SarabunPSK" w:hAnsi="TH SarabunPSK" w:cs="TH SarabunPSK"/>
+          <w:b/>
+          <w:bCs/>
+          <w:sz w:val="28"/>
+        </w:rPr>
+      </w:pPr>
+      <w:r>
+        <w:rPr>
+          <w:rFonts w:ascii="Segoe UI Emoji" w:hAnsi="Segoe UI Emoji" w:cs="Segoe UI Emoji"/>
+          <w:b/>
+          <w:bCs/>
+          <w:sz w:val="28"/>
+        </w:rPr>
+        <w:t>📖</w:t>
       </w:r>
       <w:r>
         <w:rPr>
@@ -215,23 +372,45 @@
       <w:r>
         <w:rPr>
           <w:rFonts w:ascii="TH SarabunPSK" w:hAnsi="TH SarabunPSK" w:cs="TH SarabunPSK"/>
-          <w:sz w:val="28"/>
-          <w:cs/>
-        </w:rPr>
-        <w:t xml:space="preserve">เกมแนว </w:t>
-      </w:r>
-      <w:r>
-        <w:rPr>
-          <w:rFonts w:ascii="TH SarabunPSK" w:hAnsi="TH SarabunPSK" w:cs="TH SarabunPSK"/>
-          <w:sz w:val="28"/>
-        </w:rPr>
-        <w:t>Narrative-Driven</w:t>
-      </w:r>
-      <w:r>
-        <w:rPr>
-          <w:rFonts w:ascii="TH SarabunPSK" w:hAnsi="TH SarabunPSK" w:cs="TH SarabunPSK" w:hint="cs"/>
-          <w:sz w:val="28"/>
-          <w:cs/>
+          <w:b/>
+          <w:bCs/>
+          <w:sz w:val="28"/>
+          <w:cs/>
+        </w:rPr>
+        <w:t>โครงสร้างเนื้อเรื่อง (</w:t>
+      </w:r>
+      <w:r>
+        <w:rPr>
+          <w:rFonts w:ascii="TH SarabunPSK" w:hAnsi="TH SarabunPSK" w:cs="TH SarabunPSK"/>
+          <w:b/>
+          <w:bCs/>
+          <w:sz w:val="28"/>
+        </w:rPr>
+        <w:t>The Full Narrative)</w:t>
+      </w:r>
+    </w:p>
+    <w:p>
+      <w:pPr>
+        <w:rPr>
+          <w:rFonts w:ascii="TH SarabunPSK" w:hAnsi="TH SarabunPSK" w:cs="TH SarabunPSK"/>
+          <w:b/>
+          <w:bCs/>
+          <w:sz w:val="28"/>
+        </w:rPr>
+      </w:pPr>
+      <w:r>
+        <w:rPr>
+          <w:rFonts w:ascii="TH SarabunPSK" w:hAnsi="TH SarabunPSK" w:cs="TH SarabunPSK"/>
+          <w:b/>
+          <w:bCs/>
+          <w:sz w:val="28"/>
+        </w:rPr>
+        <w:t xml:space="preserve">Part 1: The Awakening </w:t>
+      </w:r>
+      <w:r>
+        <w:rPr>
+          <w:rFonts w:ascii="TH SarabunPSK" w:hAnsi="TH SarabunPSK" w:cs="TH SarabunPSK"/>
+          <w:sz w:val="28"/>
         </w:rPr>
         <w:t>(</w:t>
       </w:r>
@@ -241,219 +420,6 @@
           <w:sz w:val="28"/>
           <w:cs/>
         </w:rPr>
-        <w:t>เน้นเนื้อเรื่อง</w:t>
-      </w:r>
-      <w:r>
-        <w:rPr>
-          <w:rFonts w:ascii="TH SarabunPSK" w:hAnsi="TH SarabunPSK" w:cs="TH SarabunPSK" w:hint="cs"/>
-          <w:sz w:val="28"/>
-          <w:cs/>
-        </w:rPr>
-        <w:t>)</w:t>
-      </w:r>
-      <w:r>
-        <w:rPr>
-          <w:rFonts w:ascii="TH SarabunPSK" w:hAnsi="TH SarabunPSK" w:cs="TH SarabunPSK"/>
-          <w:sz w:val="28"/>
-        </w:rPr>
-        <w:t xml:space="preserve"> </w:t>
-      </w:r>
-      <w:r>
-        <w:rPr>
-          <w:rFonts w:ascii="TH SarabunPSK" w:hAnsi="TH SarabunPSK" w:cs="TH SarabunPSK"/>
-          <w:sz w:val="28"/>
-          <w:cs/>
-        </w:rPr>
-        <w:t>ที่ผู้เล่นสวมบทบาทเป็นสัตว์เลี้ยงผู้มองเห็น "อารมณ์" (</w:t>
-      </w:r>
-      <w:r>
-        <w:rPr>
-          <w:rFonts w:ascii="TH SarabunPSK" w:hAnsi="TH SarabunPSK" w:cs="TH SarabunPSK"/>
-          <w:sz w:val="28"/>
-        </w:rPr>
-        <w:t xml:space="preserve">Aura) </w:t>
-      </w:r>
-      <w:r>
-        <w:rPr>
-          <w:rFonts w:ascii="TH SarabunPSK" w:hAnsi="TH SarabunPSK" w:cs="TH SarabunPSK"/>
-          <w:sz w:val="28"/>
-          <w:cs/>
-        </w:rPr>
-        <w:t>ของเจ้าของ โดยทุกการตัดสินใจเพื่อเยียวยาเจ้าของ จะสะท้อนว่าคุณ</w:t>
-      </w:r>
-      <w:r>
-        <w:rPr>
-          <w:rFonts w:ascii="TH SarabunPSK" w:hAnsi="TH SarabunPSK" w:cs="TH SarabunPSK" w:hint="cs"/>
-          <w:sz w:val="28"/>
-          <w:cs/>
-        </w:rPr>
-        <w:t>เป็นสัตว์เลี้ยงที่แสดงออกภาษารักแบบไห</w:t>
-      </w:r>
-      <w:r>
-        <w:rPr>
-          <w:rFonts w:ascii="TH SarabunPSK" w:hAnsi="TH SarabunPSK" w:cs="TH SarabunPSK" w:hint="cs"/>
-          <w:sz w:val="28"/>
-          <w:cs/>
-        </w:rPr>
-        <w:t>น</w:t>
-      </w:r>
-    </w:p>
-    <w:p>
-      <w:pPr>
-        <w:ind w:left="360"/>
-        <w:rPr>
-          <w:rFonts w:ascii="TH SarabunPSK" w:hAnsi="TH SarabunPSK" w:cs="TH SarabunPSK"/>
-          <w:b/>
-          <w:bCs/>
-          <w:sz w:val="28"/>
-        </w:rPr>
-      </w:pPr>
-      <w:r>
-        <w:rPr>
-          <w:rFonts w:ascii="TH SarabunPSK" w:hAnsi="TH SarabunPSK" w:cs="TH SarabunPSK"/>
-          <w:b/>
-          <w:bCs/>
-          <w:sz w:val="28"/>
-          <w:cs/>
-        </w:rPr>
-        <w:t>แนวคำถามและการดำเนินเรื่อง (</w:t>
-      </w:r>
-      <w:r>
-        <w:rPr>
-          <w:rFonts w:ascii="TH SarabunPSK" w:hAnsi="TH SarabunPSK" w:cs="TH SarabunPSK"/>
-          <w:b/>
-          <w:bCs/>
-          <w:sz w:val="28"/>
-        </w:rPr>
-        <w:t>The Decision Matrix)</w:t>
-      </w:r>
-      <w:r>
-        <w:rPr>
-          <w:rFonts w:ascii="TH SarabunPSK" w:hAnsi="TH SarabunPSK" w:cs="TH SarabunPSK" w:hint="cs"/>
-          <w:b/>
-          <w:bCs/>
-          <w:sz w:val="28"/>
-          <w:cs/>
-        </w:rPr>
-        <w:t xml:space="preserve"> </w:t>
-      </w:r>
-      <w:r>
-        <w:rPr>
-          <w:rFonts w:ascii="TH SarabunPSK" w:hAnsi="TH SarabunPSK" w:cs="TH SarabunPSK"/>
-          <w:sz w:val="28"/>
-          <w:cs/>
-        </w:rPr>
-        <w:t>ในแต่ละสถานการณ์ (</w:t>
-      </w:r>
-      <w:r>
-        <w:rPr>
-          <w:rFonts w:ascii="TH SarabunPSK" w:hAnsi="TH SarabunPSK" w:cs="TH SarabunPSK"/>
-          <w:sz w:val="28"/>
-        </w:rPr>
-        <w:t xml:space="preserve">Scene) </w:t>
-      </w:r>
-      <w:r>
-        <w:rPr>
-          <w:rFonts w:ascii="TH SarabunPSK" w:hAnsi="TH SarabunPSK" w:cs="TH SarabunPSK"/>
-          <w:sz w:val="28"/>
-          <w:cs/>
-        </w:rPr>
-        <w:t xml:space="preserve">ตัวเลือกจะถูกซ่อนคะแนน </w:t>
-      </w:r>
-      <w:r>
-        <w:rPr>
-          <w:rFonts w:ascii="TH SarabunPSK" w:hAnsi="TH SarabunPSK" w:cs="TH SarabunPSK"/>
-          <w:sz w:val="28"/>
-        </w:rPr>
-        <w:t xml:space="preserve">MBTI </w:t>
-      </w:r>
-      <w:r>
-        <w:rPr>
-          <w:rFonts w:ascii="TH SarabunPSK" w:hAnsi="TH SarabunPSK" w:cs="TH SarabunPSK"/>
-          <w:sz w:val="28"/>
-          <w:cs/>
-        </w:rPr>
-        <w:t>ไว้ ดังนี้:</w:t>
-      </w:r>
-    </w:p>
-    <w:p>
-      <w:pPr>
-        <w:rPr>
-          <w:rFonts w:ascii="TH SarabunPSK" w:hAnsi="TH SarabunPSK" w:cs="TH SarabunPSK"/>
-          <w:b/>
-          <w:bCs/>
-          <w:sz w:val="28"/>
-        </w:rPr>
-      </w:pPr>
-      <w:r>
-        <w:rPr>
-          <w:rFonts w:ascii="Segoe UI Emoji" w:hAnsi="Segoe UI Emoji" w:cs="Segoe UI Emoji"/>
-          <w:b/>
-          <w:bCs/>
-          <w:sz w:val="28"/>
-        </w:rPr>
-        <w:t>📖</w:t>
-      </w:r>
-      <w:r>
-        <w:rPr>
-          <w:rFonts w:ascii="TH SarabunPSK" w:hAnsi="TH SarabunPSK" w:cs="TH SarabunPSK"/>
-          <w:b/>
-          <w:bCs/>
-          <w:sz w:val="28"/>
-        </w:rPr>
-        <w:t xml:space="preserve"> </w:t>
-      </w:r>
-      <w:r>
-        <w:rPr>
-          <w:rFonts w:ascii="TH SarabunPSK" w:hAnsi="TH SarabunPSK" w:cs="TH SarabunPSK"/>
-          <w:b/>
-          <w:bCs/>
-          <w:sz w:val="28"/>
-          <w:cs/>
-        </w:rPr>
-        <w:t>โครงสร้างเนื้อเรื่อง (</w:t>
-      </w:r>
-      <w:r>
-        <w:rPr>
-          <w:rFonts w:ascii="TH SarabunPSK" w:hAnsi="TH SarabunPSK" w:cs="TH SarabunPSK"/>
-          <w:b/>
-          <w:bCs/>
-          <w:sz w:val="28"/>
-        </w:rPr>
-        <w:t>The Full Narrative)</w:t>
-      </w:r>
-    </w:p>
-    <w:p>
-      <w:pPr>
-        <w:rPr>
-          <w:rFonts w:ascii="TH SarabunPSK" w:hAnsi="TH SarabunPSK" w:cs="TH SarabunPSK"/>
-          <w:b/>
-          <w:bCs/>
-          <w:sz w:val="28"/>
-        </w:rPr>
-      </w:pPr>
-      <w:r>
-        <w:rPr>
-          <w:rFonts w:ascii="TH SarabunPSK" w:hAnsi="TH SarabunPSK" w:cs="TH SarabunPSK"/>
-          <w:b/>
-          <w:bCs/>
-          <w:sz w:val="28"/>
-        </w:rPr>
-        <w:t xml:space="preserve">Part 1: The Awakening </w:t>
-      </w:r>
-      <w:r>
-        <w:rPr>
-          <w:rFonts w:ascii="TH SarabunPSK" w:hAnsi="TH SarabunPSK" w:cs="TH SarabunPSK"/>
-          <w:sz w:val="28"/>
-        </w:rPr>
-        <w:t>(</w:t>
-      </w:r>
-      <w:r>
-        <w:rPr>
-          <w:rFonts w:ascii="TH SarabunPSK" w:hAnsi="TH SarabunPSK" w:cs="TH SarabunPSK"/>
-          <w:sz w:val="28"/>
-          <w:cs/>
-        </w:rPr>
         <w:t>จุดเริ่มต้น)</w:t>
       </w:r>
     </w:p>
@@ -506,7 +472,7 @@
     <w:p>
       <w:pPr>
         <w:rPr>
-          <w:rFonts w:ascii="TH SarabunPSK" w:hAnsi="TH SarabunPSK" w:cs="TH SarabunPSK" w:hint="cs"/>
+          <w:rFonts w:ascii="TH SarabunPSK" w:hAnsi="TH SarabunPSK" w:cs="TH SarabunPSK"/>
           <w:b/>
           <w:bCs/>
           <w:sz w:val="28"/>
@@ -608,25 +574,7 @@
           <w:sz w:val="28"/>
           <w:cs/>
         </w:rPr>
-        <w:t>วิ่งไปรอที่ประตูแล้วร้อง "แง</w:t>
-      </w:r>
-      <w:proofErr w:type="spellStart"/>
-      <w:r>
-        <w:rPr>
-          <w:rFonts w:ascii="TH SarabunPSK" w:hAnsi="TH SarabunPSK" w:cs="TH SarabunPSK"/>
-          <w:sz w:val="28"/>
-          <w:cs/>
-        </w:rPr>
-        <w:t>้ววว</w:t>
-      </w:r>
-      <w:proofErr w:type="spellEnd"/>
-      <w:r>
-        <w:rPr>
-          <w:rFonts w:ascii="TH SarabunPSK" w:hAnsi="TH SarabunPSK" w:cs="TH SarabunPSK"/>
-          <w:sz w:val="28"/>
-          <w:cs/>
-        </w:rPr>
-        <w:t xml:space="preserve">!" เสียงดังประหนึ่งไม่ได้กินข้าวมา </w:t>
+        <w:t xml:space="preserve">วิ่งไปรอที่ประตูแล้วร้อง "แง้ววว!" เสียงดังประหนึ่งไม่ได้กินข้าวมา </w:t>
       </w:r>
       <w:r>
         <w:rPr>
@@ -1128,25 +1076,7 @@
           <w:sz w:val="28"/>
           <w:cs/>
         </w:rPr>
-        <w:t>ไปคาบกระดาษ</w:t>
-      </w:r>
-      <w:proofErr w:type="spellStart"/>
-      <w:r>
-        <w:rPr>
-          <w:rFonts w:ascii="TH SarabunPSK" w:hAnsi="TH SarabunPSK" w:cs="TH SarabunPSK"/>
-          <w:sz w:val="28"/>
-          <w:cs/>
-        </w:rPr>
-        <w:t>ทิชชู่</w:t>
-      </w:r>
-      <w:proofErr w:type="spellEnd"/>
-      <w:r>
-        <w:rPr>
-          <w:rFonts w:ascii="TH SarabunPSK" w:hAnsi="TH SarabunPSK" w:cs="TH SarabunPSK"/>
-          <w:sz w:val="28"/>
-          <w:cs/>
-        </w:rPr>
-        <w:t>มาวางไว้ข้างๆ (แบบกวนๆ)</w:t>
+        <w:t>ไปคาบกระดาษทิชชู่มาวางไว้ข้างๆ (แบบกวนๆ)</w:t>
       </w:r>
       <w:r>
         <w:rPr>
@@ -1722,7 +1652,7 @@
     <w:p>
       <w:pPr>
         <w:rPr>
-          <w:rFonts w:ascii="TH SarabunPSK" w:hAnsi="TH SarabunPSK" w:cs="TH SarabunPSK" w:hint="cs"/>
+          <w:rFonts w:ascii="TH SarabunPSK" w:hAnsi="TH SarabunPSK" w:cs="TH SarabunPSK"/>
           <w:b/>
           <w:bCs/>
           <w:sz w:val="28"/>
@@ -2592,7 +2522,23 @@
           <w:sz w:val="28"/>
           <w:cs/>
         </w:rPr>
-        <w:t>มีนกเกาะอยู่ที่กิ่งไม้นอกหน้าต่าง</w:t>
+        <w:t>มีนกเกาะอยู่ที่</w:t>
+      </w:r>
+      <w:r>
+        <w:rPr>
+          <w:rFonts w:ascii="TH SarabunPSK" w:hAnsi="TH SarabunPSK" w:cs="TH SarabunPSK" w:hint="cs"/>
+          <w:sz w:val="28"/>
+          <w:cs/>
+        </w:rPr>
+        <w:t>ขอบ</w:t>
+      </w:r>
+      <w:r>
+        <w:rPr>
+          <w:rFonts w:ascii="TH SarabunPSK" w:hAnsi="TH SarabunPSK" w:cs="TH SarabunPSK"/>
+          <w:sz w:val="28"/>
+          <w:cs/>
+        </w:rPr>
+        <w:t>หน้าต่าง</w:t>
       </w:r>
     </w:p>
     <w:p>
@@ -2627,25 +2573,7 @@
           <w:sz w:val="28"/>
           <w:cs/>
         </w:rPr>
-        <w:t>ทำเสียง "แง</w:t>
-      </w:r>
-      <w:proofErr w:type="spellStart"/>
-      <w:r>
-        <w:rPr>
-          <w:rFonts w:ascii="TH SarabunPSK" w:hAnsi="TH SarabunPSK" w:cs="TH SarabunPSK"/>
-          <w:sz w:val="28"/>
-          <w:cs/>
-        </w:rPr>
-        <w:t>๊ะๆๆ</w:t>
-      </w:r>
-      <w:proofErr w:type="spellEnd"/>
-      <w:r>
-        <w:rPr>
-          <w:rFonts w:ascii="TH SarabunPSK" w:hAnsi="TH SarabunPSK" w:cs="TH SarabunPSK"/>
-          <w:sz w:val="28"/>
-          <w:cs/>
-        </w:rPr>
-        <w:t>" พยายามจะหาวิธีเปิดหน้าต่างออกไปจับ</w:t>
+        <w:t>ทำเสียง "แง๊ะๆๆ" พยายามจะหาวิธีเปิดหน้าต่างออกไปจับ</w:t>
       </w:r>
       <w:r>
         <w:rPr>
@@ -3123,25 +3051,7 @@
           <w:sz w:val="28"/>
           <w:cs/>
         </w:rPr>
-        <w:t>แมวส้ม/แมว</w:t>
-      </w:r>
-      <w:proofErr w:type="spellStart"/>
-      <w:r>
-        <w:rPr>
-          <w:rFonts w:ascii="TH SarabunPSK" w:hAnsi="TH SarabunPSK" w:cs="TH SarabunPSK"/>
-          <w:sz w:val="28"/>
-          <w:cs/>
-        </w:rPr>
-        <w:t>เบ</w:t>
-      </w:r>
-      <w:proofErr w:type="spellEnd"/>
-      <w:r>
-        <w:rPr>
-          <w:rFonts w:ascii="TH SarabunPSK" w:hAnsi="TH SarabunPSK" w:cs="TH SarabunPSK"/>
-          <w:sz w:val="28"/>
-          <w:cs/>
-        </w:rPr>
-        <w:t>งกอล</w:t>
+        <w:t>แมวส้ม/แมวเบงกอล</w:t>
       </w:r>
       <w:r>
         <w:rPr>
@@ -3271,18 +3181,8 @@
           <w:sz w:val="28"/>
           <w:cs/>
         </w:rPr>
-        <w:t>แมวแร็กดอล/น้องควอกก</w:t>
-      </w:r>
-      <w:proofErr w:type="spellStart"/>
-      <w:r>
-        <w:rPr>
-          <w:rFonts w:ascii="TH SarabunPSK" w:hAnsi="TH SarabunPSK" w:cs="TH SarabunPSK"/>
-          <w:sz w:val="28"/>
-          <w:cs/>
-        </w:rPr>
-        <w:t>้า</w:t>
-      </w:r>
-      <w:proofErr w:type="spellEnd"/>
+        <w:t>แมวแร็กดอล/น้องควอกก้า</w:t>
+      </w:r>
       <w:r>
         <w:rPr>
           <w:rFonts w:ascii="TH SarabunPSK" w:hAnsi="TH SarabunPSK" w:cs="TH SarabunPSK"/>
@@ -3296,25 +3196,7 @@
           <w:sz w:val="28"/>
           <w:cs/>
         </w:rPr>
-        <w:t>สาย</w:t>
-      </w:r>
-      <w:proofErr w:type="spellStart"/>
-      <w:r>
-        <w:rPr>
-          <w:rFonts w:ascii="TH SarabunPSK" w:hAnsi="TH SarabunPSK" w:cs="TH SarabunPSK"/>
-          <w:sz w:val="28"/>
-          <w:cs/>
-        </w:rPr>
-        <w:t>ซัพ</w:t>
-      </w:r>
-      <w:proofErr w:type="spellEnd"/>
-      <w:r>
-        <w:rPr>
-          <w:rFonts w:ascii="TH SarabunPSK" w:hAnsi="TH SarabunPSK" w:cs="TH SarabunPSK"/>
-          <w:sz w:val="28"/>
-          <w:cs/>
-        </w:rPr>
-        <w:t>พอร์ตอารมณ์)</w:t>
+        <w:t>สายซัพพอร์ตอารมณ์)</w:t>
       </w:r>
     </w:p>
     <w:p>
@@ -3364,25 +3246,7 @@
           <w:sz w:val="28"/>
           <w:cs/>
         </w:rPr>
-        <w:t>แมวส</w:t>
-      </w:r>
-      <w:proofErr w:type="spellStart"/>
-      <w:r>
-        <w:rPr>
-          <w:rFonts w:ascii="TH SarabunPSK" w:hAnsi="TH SarabunPSK" w:cs="TH SarabunPSK"/>
-          <w:sz w:val="28"/>
-          <w:cs/>
-        </w:rPr>
-        <w:t>ฟิงซ์</w:t>
-      </w:r>
-      <w:proofErr w:type="spellEnd"/>
-      <w:r>
-        <w:rPr>
-          <w:rFonts w:ascii="TH SarabunPSK" w:hAnsi="TH SarabunPSK" w:cs="TH SarabunPSK"/>
-          <w:sz w:val="28"/>
-          <w:cs/>
-        </w:rPr>
-        <w:t>/เมนคูน</w:t>
+        <w:t>แมวสฟิงซ์/เมนคูน</w:t>
       </w:r>
       <w:r>
         <w:rPr>
@@ -3631,29 +3495,7 @@
           <w:sz w:val="28"/>
           <w:cs/>
         </w:rPr>
-        <w:t>รินหยุดชะงักที่หน้าประตู เธอขมวดคิ้วเหมือนได้ยินเสียง "เมี</w:t>
-      </w:r>
-      <w:proofErr w:type="spellStart"/>
-      <w:r>
-        <w:rPr>
-          <w:rFonts w:ascii="TH SarabunPSK" w:hAnsi="TH SarabunPSK" w:cs="TH SarabunPSK"/>
-          <w:b/>
-          <w:bCs/>
-          <w:sz w:val="28"/>
-          <w:cs/>
-        </w:rPr>
-        <w:t>๊ยว</w:t>
-      </w:r>
-      <w:proofErr w:type="spellEnd"/>
-      <w:r>
-        <w:rPr>
-          <w:rFonts w:ascii="TH SarabunPSK" w:hAnsi="TH SarabunPSK" w:cs="TH SarabunPSK"/>
-          <w:b/>
-          <w:bCs/>
-          <w:sz w:val="28"/>
-          <w:cs/>
-        </w:rPr>
-        <w:t>" แว่วมาในอากาศ รอยยิ้มจางๆ ปรากฏขึ้น</w:t>
+        <w:t>รินหยุดชะงักที่หน้าประตู เธอขมวดคิ้วเหมือนได้ยินเสียง "เมี๊ยว" แว่วมาในอากาศ รอยยิ้มจางๆ ปรากฏขึ้น</w:t>
       </w:r>
       <w:r>
         <w:rPr>
@@ -4128,29 +3970,7 @@
           <w:sz w:val="28"/>
           <w:cs/>
         </w:rPr>
-        <w:t>ข (คาบ</w:t>
-      </w:r>
-      <w:proofErr w:type="spellStart"/>
-      <w:r>
-        <w:rPr>
-          <w:rFonts w:ascii="TH SarabunPSK" w:hAnsi="TH SarabunPSK" w:cs="TH SarabunPSK"/>
-          <w:b/>
-          <w:bCs/>
-          <w:sz w:val="28"/>
-          <w:cs/>
-        </w:rPr>
-        <w:t>ทิชชู่</w:t>
-      </w:r>
-      <w:proofErr w:type="spellEnd"/>
-      <w:r>
-        <w:rPr>
-          <w:rFonts w:ascii="TH SarabunPSK" w:hAnsi="TH SarabunPSK" w:cs="TH SarabunPSK"/>
-          <w:b/>
-          <w:bCs/>
-          <w:sz w:val="28"/>
-          <w:cs/>
-        </w:rPr>
-        <w:t>กวนๆ)</w:t>
+        <w:t>ข (คาบทิชชู่กวนๆ)</w:t>
       </w:r>
       <w:r>
         <w:rPr>
@@ -4789,7 +4609,7 @@
           <w:sz w:val="28"/>
         </w:rPr>
         <w:pict w14:anchorId="1CAE9C75">
-          <v:rect id="_x0000_i1040" style="width:0;height:1.5pt" o:hralign="center" o:hrstd="t" o:hr="t" fillcolor="#a0a0a0" stroked="f"/>
+          <v:rect id="_x0000_i1025" style="width:0;height:1.5pt" o:hralign="center" o:hrstd="t" o:hr="t" fillcolor="#a0a0a0" stroked="f"/>
         </w:pict>
       </w:r>
     </w:p>
@@ -5707,29 +5527,7 @@
           <w:sz w:val="28"/>
           <w:cs/>
         </w:rPr>
-        <w:t>ก (ส่งเสียงแง</w:t>
-      </w:r>
-      <w:proofErr w:type="spellStart"/>
-      <w:r>
-        <w:rPr>
-          <w:rFonts w:ascii="TH SarabunPSK" w:hAnsi="TH SarabunPSK" w:cs="TH SarabunPSK"/>
-          <w:b/>
-          <w:bCs/>
-          <w:sz w:val="28"/>
-          <w:cs/>
-        </w:rPr>
-        <w:t>๊ะๆ</w:t>
-      </w:r>
-      <w:proofErr w:type="spellEnd"/>
-      <w:r>
-        <w:rPr>
-          <w:rFonts w:ascii="TH SarabunPSK" w:hAnsi="TH SarabunPSK" w:cs="TH SarabunPSK"/>
-          <w:b/>
-          <w:bCs/>
-          <w:sz w:val="28"/>
-          <w:cs/>
-        </w:rPr>
-        <w:t xml:space="preserve"> จะจับ)</w:t>
+        <w:t>ก (ส่งเสียงแง๊ะๆ จะจับ)</w:t>
       </w:r>
       <w:r>
         <w:rPr>
@@ -6076,7 +5874,7 @@
           <w:numId w:val="29"/>
         </w:numPr>
         <w:rPr>
-          <w:rFonts w:ascii="TH SarabunPSK" w:hAnsi="TH SarabunPSK" w:cs="TH SarabunPSK" w:hint="cs"/>
+          <w:rFonts w:ascii="TH SarabunPSK" w:hAnsi="TH SarabunPSK" w:cs="TH SarabunPSK"/>
           <w:b/>
           <w:bCs/>
           <w:sz w:val="28"/>
@@ -6235,25 +6033,7 @@
           <w:sz w:val="28"/>
           <w:cs/>
         </w:rPr>
-        <w:t>กราฟิก: หมอกสีเทาจางหายไป มีแสงสว่างวาบขึ้นมาตรงหน้ากระจก พร้อมเสียงแอฟเฟก</w:t>
-      </w:r>
-      <w:proofErr w:type="spellStart"/>
-      <w:r>
-        <w:rPr>
-          <w:rFonts w:ascii="TH SarabunPSK" w:hAnsi="TH SarabunPSK" w:cs="TH SarabunPSK"/>
-          <w:sz w:val="28"/>
-          <w:cs/>
-        </w:rPr>
-        <w:t>ต์วิ้งค์ๆ</w:t>
-      </w:r>
-      <w:proofErr w:type="spellEnd"/>
-      <w:r>
-        <w:rPr>
-          <w:rFonts w:ascii="TH SarabunPSK" w:hAnsi="TH SarabunPSK" w:cs="TH SarabunPSK"/>
-          <w:sz w:val="28"/>
-          <w:cs/>
-        </w:rPr>
-        <w:t xml:space="preserve"> </w:t>
+        <w:t xml:space="preserve">กราฟิก: หมอกสีเทาจางหายไป มีแสงสว่างวาบขึ้นมาตรงหน้ากระจก พร้อมเสียงแอฟเฟกต์วิ้งค์ๆ </w:t>
       </w:r>
       <w:r>
         <w:rPr>
@@ -6578,7 +6358,7 @@
           <w:numId w:val="30"/>
         </w:numPr>
         <w:rPr>
-          <w:rFonts w:ascii="TH SarabunPSK" w:hAnsi="TH SarabunPSK" w:cs="TH SarabunPSK" w:hint="cs"/>
+          <w:rFonts w:ascii="TH SarabunPSK" w:hAnsi="TH SarabunPSK" w:cs="TH SarabunPSK"/>
           <w:sz w:val="28"/>
         </w:rPr>
       </w:pPr>
@@ -6682,25 +6462,7 @@
           <w:sz w:val="28"/>
           <w:cs/>
         </w:rPr>
-        <w:t>จากสถานการณ์ที่คุณเลือก คุณไม่ใช่สาย</w:t>
-      </w:r>
-      <w:proofErr w:type="spellStart"/>
-      <w:r>
-        <w:rPr>
-          <w:rFonts w:ascii="TH SarabunPSK" w:hAnsi="TH SarabunPSK" w:cs="TH SarabunPSK"/>
-          <w:sz w:val="28"/>
-          <w:cs/>
-        </w:rPr>
-        <w:t>ซัพ</w:t>
-      </w:r>
-      <w:proofErr w:type="spellEnd"/>
-      <w:r>
-        <w:rPr>
-          <w:rFonts w:ascii="TH SarabunPSK" w:hAnsi="TH SarabunPSK" w:cs="TH SarabunPSK"/>
-          <w:sz w:val="28"/>
-          <w:cs/>
-        </w:rPr>
-        <w:t>พอร์ตที่มานั่งร้องไห้เป็นเพื่อน แต่คุณคือตัวตึงที่พร้อมจะ</w:t>
+        <w:t>จากสถานการณ์ที่คุณเลือก คุณไม่ใช่สายซัพพอร์ตที่มานั่งร้องไห้เป็นเพื่อน แต่คุณคือตัวตึงที่พร้อมจะ</w:t>
       </w:r>
       <w:r>
         <w:rPr>
@@ -6918,29 +6680,7 @@
           <w:sz w:val="28"/>
           <w:cs/>
         </w:rPr>
-        <w:t>มุมแชร์ลงโซ</w:t>
-      </w:r>
-      <w:proofErr w:type="spellStart"/>
-      <w:r>
-        <w:rPr>
-          <w:rFonts w:ascii="TH SarabunPSK" w:hAnsi="TH SarabunPSK" w:cs="TH SarabunPSK"/>
-          <w:b/>
-          <w:bCs/>
-          <w:sz w:val="28"/>
-          <w:cs/>
-        </w:rPr>
-        <w:t>เชีย</w:t>
-      </w:r>
-      <w:proofErr w:type="spellEnd"/>
-      <w:r>
-        <w:rPr>
-          <w:rFonts w:ascii="TH SarabunPSK" w:hAnsi="TH SarabunPSK" w:cs="TH SarabunPSK"/>
-          <w:b/>
-          <w:bCs/>
-          <w:sz w:val="28"/>
-          <w:cs/>
-        </w:rPr>
-        <w:t>ล (</w:t>
+        <w:t>มุมแชร์ลงโซเชียล (</w:t>
       </w:r>
       <w:r>
         <w:rPr>
@@ -7026,25 +6766,7 @@
           <w:sz w:val="28"/>
           <w:cs/>
         </w:rPr>
-        <w:t>ถึงฉันจะชอบวิ่งชนข้าวของพัง แต่ฉันก็พุ่งชนความเศร้าของแกจนพังเหมือนกันนะ</w:t>
-      </w:r>
-      <w:proofErr w:type="spellStart"/>
-      <w:r>
-        <w:rPr>
-          <w:rFonts w:ascii="TH SarabunPSK" w:hAnsi="TH SarabunPSK" w:cs="TH SarabunPSK"/>
-          <w:sz w:val="28"/>
-          <w:cs/>
-        </w:rPr>
-        <w:t>นัง</w:t>
-      </w:r>
-      <w:proofErr w:type="spellEnd"/>
-      <w:r>
-        <w:rPr>
-          <w:rFonts w:ascii="TH SarabunPSK" w:hAnsi="TH SarabunPSK" w:cs="TH SarabunPSK"/>
-          <w:sz w:val="28"/>
-          <w:cs/>
-        </w:rPr>
-        <w:t xml:space="preserve">มนุษย์! </w:t>
+        <w:t xml:space="preserve">ถึงฉันจะชอบวิ่งชนข้าวของพัง แต่ฉันก็พุ่งชนความเศร้าของแกจนพังเหมือนกันนะนังมนุษย์! </w:t>
       </w:r>
       <w:r>
         <w:rPr>
@@ -7068,25 +6790,7 @@
           <w:sz w:val="28"/>
           <w:cs/>
         </w:rPr>
-        <w:t>มาดูสิว่าคุณเป็นแมวมีมตัวไหนที่คอย</w:t>
-      </w:r>
-      <w:proofErr w:type="spellStart"/>
-      <w:r>
-        <w:rPr>
-          <w:rFonts w:ascii="TH SarabunPSK" w:hAnsi="TH SarabunPSK" w:cs="TH SarabunPSK"/>
-          <w:sz w:val="28"/>
-          <w:cs/>
-        </w:rPr>
-        <w:t>ฮีล</w:t>
-      </w:r>
-      <w:proofErr w:type="spellEnd"/>
-      <w:r>
-        <w:rPr>
-          <w:rFonts w:ascii="TH SarabunPSK" w:hAnsi="TH SarabunPSK" w:cs="TH SarabunPSK"/>
-          <w:sz w:val="28"/>
-          <w:cs/>
-        </w:rPr>
-        <w:t>ใจเจ้าของ</w:t>
+        <w:t>มาดูสิว่าคุณเป็นแมวมีมตัวไหนที่คอยฮีลใจเจ้าของ</w:t>
       </w:r>
       <w:r>
         <w:rPr>
@@ -7162,25 +6866,7 @@
           <w:sz w:val="28"/>
           <w:cs/>
         </w:rPr>
-        <w:t>แมวมี</w:t>
-      </w:r>
-      <w:proofErr w:type="spellStart"/>
-      <w:r>
-        <w:rPr>
-          <w:rFonts w:ascii="TH SarabunPSK" w:hAnsi="TH SarabunPSK" w:cs="TH SarabunPSK"/>
-          <w:sz w:val="28"/>
-          <w:cs/>
-        </w:rPr>
-        <w:t>มฮีล</w:t>
-      </w:r>
-      <w:proofErr w:type="spellEnd"/>
-      <w:r>
-        <w:rPr>
-          <w:rFonts w:ascii="TH SarabunPSK" w:hAnsi="TH SarabunPSK" w:cs="TH SarabunPSK"/>
-          <w:sz w:val="28"/>
-          <w:cs/>
-        </w:rPr>
-        <w:t>ใจ"</w:t>
+        <w:t>แมวมีมฮีลใจ"</w:t>
       </w:r>
     </w:p>
     <w:p>
@@ -7249,7 +6935,7 @@
     <w:p>
       <w:pPr>
         <w:rPr>
-          <w:rFonts w:ascii="TH SarabunPSK" w:hAnsi="TH SarabunPSK" w:cs="TH SarabunPSK" w:hint="cs"/>
+          <w:rFonts w:ascii="TH SarabunPSK" w:hAnsi="TH SarabunPSK" w:cs="TH SarabunPSK"/>
           <w:b/>
           <w:bCs/>
           <w:sz w:val="28"/>
@@ -7370,7 +7056,7 @@
           <w:numId w:val="7"/>
         </w:numPr>
         <w:rPr>
-          <w:rFonts w:ascii="TH SarabunPSK" w:hAnsi="TH SarabunPSK" w:cs="TH SarabunPSK" w:hint="cs"/>
+          <w:rFonts w:ascii="TH SarabunPSK" w:hAnsi="TH SarabunPSK" w:cs="TH SarabunPSK"/>
           <w:sz w:val="28"/>
         </w:rPr>
       </w:pPr>
@@ -7423,7 +7109,7 @@
           <w:numId w:val="7"/>
         </w:numPr>
         <w:rPr>
-          <w:rFonts w:ascii="TH SarabunPSK" w:hAnsi="TH SarabunPSK" w:cs="TH SarabunPSK" w:hint="cs"/>
+          <w:rFonts w:ascii="TH SarabunPSK" w:hAnsi="TH SarabunPSK" w:cs="TH SarabunPSK"/>
           <w:sz w:val="28"/>
         </w:rPr>
       </w:pPr>
@@ -7459,7 +7145,7 @@
           <w:numId w:val="7"/>
         </w:numPr>
         <w:rPr>
-          <w:rFonts w:ascii="TH SarabunPSK" w:hAnsi="TH SarabunPSK" w:cs="TH SarabunPSK" w:hint="cs"/>
+          <w:rFonts w:ascii="TH SarabunPSK" w:hAnsi="TH SarabunPSK" w:cs="TH SarabunPSK"/>
           <w:sz w:val="28"/>
         </w:rPr>
       </w:pPr>
@@ -7495,7 +7181,7 @@
           <w:numId w:val="7"/>
         </w:numPr>
         <w:rPr>
-          <w:rFonts w:ascii="TH SarabunPSK" w:hAnsi="TH SarabunPSK" w:cs="TH SarabunPSK" w:hint="cs"/>
+          <w:rFonts w:ascii="TH SarabunPSK" w:hAnsi="TH SarabunPSK" w:cs="TH SarabunPSK"/>
           <w:sz w:val="28"/>
         </w:rPr>
       </w:pPr>
@@ -7548,7 +7234,7 @@
           <w:numId w:val="7"/>
         </w:numPr>
         <w:rPr>
-          <w:rFonts w:ascii="TH SarabunPSK" w:hAnsi="TH SarabunPSK" w:cs="TH SarabunPSK" w:hint="cs"/>
+          <w:rFonts w:ascii="TH SarabunPSK" w:hAnsi="TH SarabunPSK" w:cs="TH SarabunPSK"/>
           <w:sz w:val="28"/>
         </w:rPr>
       </w:pPr>
@@ -7599,7 +7285,7 @@
           <w:numId w:val="7"/>
         </w:numPr>
         <w:rPr>
-          <w:rFonts w:ascii="TH SarabunPSK" w:hAnsi="TH SarabunPSK" w:cs="TH SarabunPSK" w:hint="cs"/>
+          <w:rFonts w:ascii="TH SarabunPSK" w:hAnsi="TH SarabunPSK" w:cs="TH SarabunPSK"/>
           <w:sz w:val="28"/>
         </w:rPr>
       </w:pPr>
@@ -7650,7 +7336,7 @@
           <w:numId w:val="7"/>
         </w:numPr>
         <w:rPr>
-          <w:rFonts w:ascii="TH SarabunPSK" w:hAnsi="TH SarabunPSK" w:cs="TH SarabunPSK" w:hint="cs"/>
+          <w:rFonts w:ascii="TH SarabunPSK" w:hAnsi="TH SarabunPSK" w:cs="TH SarabunPSK"/>
           <w:sz w:val="28"/>
         </w:rPr>
       </w:pPr>
@@ -7703,7 +7389,7 @@
           <w:numId w:val="7"/>
         </w:numPr>
         <w:rPr>
-          <w:rFonts w:ascii="TH SarabunPSK" w:hAnsi="TH SarabunPSK" w:cs="TH SarabunPSK" w:hint="cs"/>
+          <w:rFonts w:ascii="TH SarabunPSK" w:hAnsi="TH SarabunPSK" w:cs="TH SarabunPSK"/>
           <w:sz w:val="28"/>
         </w:rPr>
       </w:pPr>
@@ -7754,7 +7440,7 @@
           <w:numId w:val="7"/>
         </w:numPr>
         <w:rPr>
-          <w:rFonts w:ascii="TH SarabunPSK" w:hAnsi="TH SarabunPSK" w:cs="TH SarabunPSK" w:hint="cs"/>
+          <w:rFonts w:ascii="TH SarabunPSK" w:hAnsi="TH SarabunPSK" w:cs="TH SarabunPSK"/>
           <w:sz w:val="28"/>
         </w:rPr>
       </w:pPr>
@@ -7805,7 +7491,7 @@
           <w:numId w:val="7"/>
         </w:numPr>
         <w:rPr>
-          <w:rFonts w:ascii="TH SarabunPSK" w:hAnsi="TH SarabunPSK" w:cs="TH SarabunPSK" w:hint="cs"/>
+          <w:rFonts w:ascii="TH SarabunPSK" w:hAnsi="TH SarabunPSK" w:cs="TH SarabunPSK"/>
           <w:sz w:val="28"/>
         </w:rPr>
       </w:pPr>
@@ -7858,7 +7544,7 @@
           <w:numId w:val="7"/>
         </w:numPr>
         <w:rPr>
-          <w:rFonts w:ascii="TH SarabunPSK" w:hAnsi="TH SarabunPSK" w:cs="TH SarabunPSK" w:hint="cs"/>
+          <w:rFonts w:ascii="TH SarabunPSK" w:hAnsi="TH SarabunPSK" w:cs="TH SarabunPSK"/>
           <w:sz w:val="28"/>
         </w:rPr>
       </w:pPr>
@@ -7894,28 +7580,28 @@
           <w:numId w:val="7"/>
         </w:numPr>
         <w:rPr>
+          <w:rFonts w:ascii="TH SarabunPSK" w:hAnsi="TH SarabunPSK" w:cs="TH SarabunPSK"/>
+          <w:sz w:val="28"/>
+        </w:rPr>
+      </w:pPr>
+      <w:r>
+        <w:rPr>
           <w:rFonts w:ascii="TH SarabunPSK" w:hAnsi="TH SarabunPSK" w:cs="TH SarabunPSK" w:hint="cs"/>
           <w:sz w:val="28"/>
-        </w:rPr>
-      </w:pPr>
+          <w:cs/>
+        </w:rPr>
+        <w:t>ปรับตัวตามอารมณ์เจ้าของในขณะนั้น/เล่นตามสถานการณ์ =</w:t>
+      </w:r>
       <w:r>
         <w:rPr>
           <w:rFonts w:ascii="TH SarabunPSK" w:hAnsi="TH SarabunPSK" w:cs="TH SarabunPSK" w:hint="cs"/>
           <w:sz w:val="28"/>
-          <w:cs/>
-        </w:rPr>
-        <w:t>ปรับตัวตามอารมณ์เจ้าของในขณะนั้น/เล่นตามสถานการณ์ =</w:t>
+        </w:rPr>
+        <w:t xml:space="preserve"> </w:t>
       </w:r>
       <w:r>
         <w:rPr>
           <w:rFonts w:ascii="TH SarabunPSK" w:hAnsi="TH SarabunPSK" w:cs="TH SarabunPSK" w:hint="cs"/>
-          <w:sz w:val="28"/>
-        </w:rPr>
-        <w:t xml:space="preserve"> </w:t>
-      </w:r>
-      <w:r>
-        <w:rPr>
-          <w:rFonts w:ascii="TH SarabunPSK" w:hAnsi="TH SarabunPSK" w:cs="TH SarabunPSK" w:hint="cs"/>
           <w:b/>
           <w:bCs/>
           <w:sz w:val="28"/>
@@ -7926,7 +7612,7 @@
     <w:p>
       <w:pPr>
         <w:rPr>
-          <w:rFonts w:ascii="TH SarabunPSK" w:hAnsi="TH SarabunPSK" w:cs="TH SarabunPSK" w:hint="cs"/>
+          <w:rFonts w:ascii="TH SarabunPSK" w:hAnsi="TH SarabunPSK" w:cs="TH SarabunPSK"/>
           <w:b/>
           <w:bCs/>
           <w:sz w:val="28"/>
@@ -8001,7 +7687,7 @@
           <w:numId w:val="8"/>
         </w:numPr>
         <w:rPr>
-          <w:rFonts w:ascii="TH SarabunPSK" w:hAnsi="TH SarabunPSK" w:cs="TH SarabunPSK" w:hint="cs"/>
+          <w:rFonts w:ascii="TH SarabunPSK" w:hAnsi="TH SarabunPSK" w:cs="TH SarabunPSK"/>
           <w:sz w:val="28"/>
         </w:rPr>
       </w:pPr>
@@ -8075,7 +7761,7 @@
           <w:numId w:val="8"/>
         </w:numPr>
         <w:rPr>
-          <w:rFonts w:ascii="TH SarabunPSK" w:hAnsi="TH SarabunPSK" w:cs="TH SarabunPSK" w:hint="cs"/>
+          <w:rFonts w:ascii="TH SarabunPSK" w:hAnsi="TH SarabunPSK" w:cs="TH SarabunPSK"/>
           <w:sz w:val="28"/>
         </w:rPr>
       </w:pPr>
@@ -8156,7 +7842,7 @@
           <w:numId w:val="8"/>
         </w:numPr>
         <w:rPr>
-          <w:rFonts w:ascii="TH SarabunPSK" w:hAnsi="TH SarabunPSK" w:cs="TH SarabunPSK" w:hint="cs"/>
+          <w:rFonts w:ascii="TH SarabunPSK" w:hAnsi="TH SarabunPSK" w:cs="TH SarabunPSK"/>
           <w:sz w:val="28"/>
         </w:rPr>
       </w:pPr>
@@ -8299,7 +7985,7 @@
           <w:numId w:val="8"/>
         </w:numPr>
         <w:rPr>
-          <w:rFonts w:ascii="TH SarabunPSK" w:hAnsi="TH SarabunPSK" w:cs="TH SarabunPSK" w:hint="cs"/>
+          <w:rFonts w:ascii="TH SarabunPSK" w:hAnsi="TH SarabunPSK" w:cs="TH SarabunPSK"/>
           <w:sz w:val="28"/>
         </w:rPr>
       </w:pPr>
@@ -9309,23 +8995,13 @@
         </w:rPr>
         <w:t xml:space="preserve">2: </w:t>
       </w:r>
-      <w:proofErr w:type="spellStart"/>
-      <w:r>
-        <w:rPr>
-          <w:rFonts w:ascii="TH SarabunPSK" w:hAnsi="TH SarabunPSK" w:cs="TH SarabunPSK"/>
-          <w:sz w:val="28"/>
-          <w:cs/>
-        </w:rPr>
-        <w:t>น้อน</w:t>
-      </w:r>
-      <w:proofErr w:type="spellEnd"/>
-      <w:r>
-        <w:rPr>
-          <w:rFonts w:ascii="TH SarabunPSK" w:hAnsi="TH SarabunPSK" w:cs="TH SarabunPSK"/>
-          <w:sz w:val="28"/>
-          <w:cs/>
-        </w:rPr>
-        <w:t>สายละมุนแบบตลกๆ (</w:t>
+      <w:r>
+        <w:rPr>
+          <w:rFonts w:ascii="TH SarabunPSK" w:hAnsi="TH SarabunPSK" w:cs="TH SarabunPSK"/>
+          <w:sz w:val="28"/>
+          <w:cs/>
+        </w:rPr>
+        <w:t>น้อนสายละมุนแบบตลกๆ (</w:t>
       </w:r>
       <w:r>
         <w:rPr>
@@ -9571,29 +9247,7 @@
                 <w:sz w:val="28"/>
                 <w:cs/>
               </w:rPr>
-              <w:t>แมวบริติช (นอนพุง</w:t>
-            </w:r>
-            <w:proofErr w:type="spellStart"/>
-            <w:r>
-              <w:rPr>
-                <w:rFonts w:ascii="TH SarabunPSK" w:hAnsi="TH SarabunPSK" w:cs="TH SarabunPSK"/>
-                <w:b/>
-                <w:bCs/>
-                <w:sz w:val="28"/>
-                <w:cs/>
-              </w:rPr>
-              <w:t>โล</w:t>
-            </w:r>
-            <w:proofErr w:type="spellEnd"/>
-            <w:r>
-              <w:rPr>
-                <w:rFonts w:ascii="TH SarabunPSK" w:hAnsi="TH SarabunPSK" w:cs="TH SarabunPSK"/>
-                <w:b/>
-                <w:bCs/>
-                <w:sz w:val="28"/>
-                <w:cs/>
-              </w:rPr>
-              <w:t>)</w:t>
+              <w:t>แมวบริติช (นอนพุงโล)</w:t>
             </w:r>
           </w:p>
         </w:tc>
@@ -9754,23 +9408,13 @@
               </w:rPr>
               <w:t>"</w:t>
             </w:r>
-            <w:proofErr w:type="spellStart"/>
             <w:r>
               <w:rPr>
                 <w:rFonts w:ascii="TH SarabunPSK" w:hAnsi="TH SarabunPSK" w:cs="TH SarabunPSK"/>
                 <w:sz w:val="28"/>
                 <w:cs/>
               </w:rPr>
-              <w:t>น้อน</w:t>
-            </w:r>
-            <w:proofErr w:type="spellEnd"/>
-            <w:r>
-              <w:rPr>
-                <w:rFonts w:ascii="TH SarabunPSK" w:hAnsi="TH SarabunPSK" w:cs="TH SarabunPSK"/>
-                <w:sz w:val="28"/>
-                <w:cs/>
-              </w:rPr>
-              <w:t>พับนุ่ม"</w:t>
+              <w:t>น้อนพับนุ่ม"</w:t>
             </w:r>
           </w:p>
         </w:tc>
@@ -9996,29 +9640,7 @@
                 <w:sz w:val="28"/>
                 <w:cs/>
               </w:rPr>
-              <w:t>แมวมัน</w:t>
-            </w:r>
-            <w:proofErr w:type="spellStart"/>
-            <w:r>
-              <w:rPr>
-                <w:rFonts w:ascii="TH SarabunPSK" w:hAnsi="TH SarabunPSK" w:cs="TH SarabunPSK"/>
-                <w:b/>
-                <w:bCs/>
-                <w:sz w:val="28"/>
-                <w:cs/>
-              </w:rPr>
-              <w:t>ช์กิ้น</w:t>
-            </w:r>
-            <w:proofErr w:type="spellEnd"/>
-            <w:r>
-              <w:rPr>
-                <w:rFonts w:ascii="TH SarabunPSK" w:hAnsi="TH SarabunPSK" w:cs="TH SarabunPSK"/>
-                <w:b/>
-                <w:bCs/>
-                <w:sz w:val="28"/>
-                <w:cs/>
-              </w:rPr>
-              <w:t xml:space="preserve"> (ขาจิ๋วเด้ง)</w:t>
+              <w:t>แมวมันช์กิ้น (ขาจิ๋วเด้ง)</w:t>
             </w:r>
           </w:p>
         </w:tc>
@@ -10697,25 +10319,7 @@
                 <w:sz w:val="28"/>
                 <w:cs/>
               </w:rPr>
-              <w:t>คุณหนู</w:t>
-            </w:r>
-            <w:proofErr w:type="spellStart"/>
-            <w:r>
-              <w:rPr>
-                <w:rFonts w:ascii="TH SarabunPSK" w:hAnsi="TH SarabunPSK" w:cs="TH SarabunPSK"/>
-                <w:sz w:val="28"/>
-                <w:cs/>
-              </w:rPr>
-              <w:t>ซัพ</w:t>
-            </w:r>
-            <w:proofErr w:type="spellEnd"/>
-            <w:r>
-              <w:rPr>
-                <w:rFonts w:ascii="TH SarabunPSK" w:hAnsi="TH SarabunPSK" w:cs="TH SarabunPSK"/>
-                <w:sz w:val="28"/>
-                <w:cs/>
-              </w:rPr>
-              <w:t>พอร์ตเงียบๆ"</w:t>
+              <w:t>คุณหนูซัพพอร์ตเงียบๆ"</w:t>
             </w:r>
           </w:p>
         </w:tc>
@@ -10943,29 +10547,7 @@
           <w:sz w:val="28"/>
           <w:cs/>
         </w:rPr>
-        <w:t>สายยู</w:t>
-      </w:r>
-      <w:proofErr w:type="spellStart"/>
-      <w:r>
-        <w:rPr>
-          <w:rFonts w:ascii="TH SarabunPSK" w:hAnsi="TH SarabunPSK" w:cs="TH SarabunPSK"/>
-          <w:b/>
-          <w:bCs/>
-          <w:sz w:val="28"/>
-          <w:cs/>
-        </w:rPr>
-        <w:t>นีค</w:t>
-      </w:r>
-      <w:proofErr w:type="spellEnd"/>
-      <w:r>
-        <w:rPr>
-          <w:rFonts w:ascii="TH SarabunPSK" w:hAnsi="TH SarabunPSK" w:cs="TH SarabunPSK"/>
-          <w:b/>
-          <w:bCs/>
-          <w:sz w:val="28"/>
-          <w:cs/>
-        </w:rPr>
-        <w:t>และมีเทสแบบฮาๆ (</w:t>
+        <w:t>สายยูนีคและมีเทสแบบฮาๆ (</w:t>
       </w:r>
       <w:r>
         <w:rPr>
@@ -11213,29 +10795,7 @@
                 <w:sz w:val="28"/>
                 <w:cs/>
               </w:rPr>
-              <w:t>แมวส</w:t>
-            </w:r>
-            <w:proofErr w:type="spellStart"/>
-            <w:r>
-              <w:rPr>
-                <w:rFonts w:ascii="TH SarabunPSK" w:hAnsi="TH SarabunPSK" w:cs="TH SarabunPSK"/>
-                <w:b/>
-                <w:bCs/>
-                <w:sz w:val="28"/>
-                <w:cs/>
-              </w:rPr>
-              <w:t>ฟิงซ์</w:t>
-            </w:r>
-            <w:proofErr w:type="spellEnd"/>
-            <w:r>
-              <w:rPr>
-                <w:rFonts w:ascii="TH SarabunPSK" w:hAnsi="TH SarabunPSK" w:cs="TH SarabunPSK"/>
-                <w:b/>
-                <w:bCs/>
-                <w:sz w:val="28"/>
-                <w:cs/>
-              </w:rPr>
-              <w:t xml:space="preserve"> (ท่านั่งแปลกๆ)</w:t>
+              <w:t>แมวสฟิงซ์ (ท่านั่งแปลกๆ)</w:t>
             </w:r>
           </w:p>
         </w:tc>
@@ -11702,7 +11262,7 @@
     <w:p>
       <w:pPr>
         <w:rPr>
-          <w:rFonts w:ascii="TH SarabunPSK" w:hAnsi="TH SarabunPSK" w:cs="TH SarabunPSK" w:hint="cs"/>
+          <w:rFonts w:ascii="TH SarabunPSK" w:hAnsi="TH SarabunPSK" w:cs="TH SarabunPSK"/>
           <w:sz w:val="28"/>
           <w:cs/>
         </w:rPr>
@@ -16946,6 +16506,7 @@
   <w:style w:type="character" w:default="1" w:styleId="DefaultParagraphFont">
     <w:name w:val="Default Paragraph Font"/>
     <w:uiPriority w:val="1"/>
+    <w:semiHidden/>
     <w:unhideWhenUsed/>
   </w:style>
   <w:style w:type="table" w:default="1" w:styleId="TableNormal">

</xml_diff>